<commit_message>
Importance of giving highly correlated fetaures to regression model training
</commit_message>
<xml_diff>
--- a/machine_learning_basics/correlation for linear regression.docx
+++ b/machine_learning_basics/correlation for linear regression.docx
@@ -20,8 +20,23 @@
         <w:t>) to +1(perfect positive</w:t>
       </w:r>
       <w:r>
-        <w:t xml:space="preserve"> x,y will increased</w:t>
-      </w:r>
+        <w:t xml:space="preserve"> </w:t>
+      </w:r>
+      <w:proofErr w:type="spellStart"/>
+      <w:proofErr w:type="gramStart"/>
+      <w:r>
+        <w:t>x,y</w:t>
+      </w:r>
+      <w:proofErr w:type="spellEnd"/>
+      <w:proofErr w:type="gramEnd"/>
+      <w:r>
+        <w:t xml:space="preserve"> will </w:t>
+      </w:r>
+      <w:proofErr w:type="gramStart"/>
+      <w:r>
+        <w:t>increased</w:t>
+      </w:r>
+      <w:proofErr w:type="gramEnd"/>
       <w:r>
         <w:t>), with 0 indicating no linear correlation.</w:t>
       </w:r>
@@ -310,6 +325,7 @@
         <w:rPr>
           <w:b/>
           <w:bCs/>
+          <w:noProof/>
           <w:lang w:val="en-US"/>
         </w:rPr>
         <w:drawing>
@@ -398,6 +414,7 @@
         <w:rPr>
           <w:b/>
           <w:bCs/>
+          <w:noProof/>
           <w:lang w:val="en-US"/>
         </w:rPr>
         <w:drawing>
@@ -466,6 +483,7 @@
         <w:rPr>
           <w:b/>
           <w:bCs/>
+          <w:noProof/>
           <w:lang w:val="en-US"/>
         </w:rPr>
         <w:lastRenderedPageBreak/>
@@ -494,6 +512,121 @@
                     <a:xfrm>
                       <a:off x="0" y="0"/>
                       <a:ext cx="5159187" cy="5387807"/>
+                    </a:xfrm>
+                    <a:prstGeom prst="rect">
+                      <a:avLst/>
+                    </a:prstGeom>
+                  </pic:spPr>
+                </pic:pic>
+              </a:graphicData>
+            </a:graphic>
+          </wp:inline>
+        </w:drawing>
+      </w:r>
+    </w:p>
+    <w:p>
+      <w:pPr>
+        <w:rPr>
+          <w:b/>
+          <w:bCs/>
+          <w:lang w:val="en-US"/>
+        </w:rPr>
+      </w:pPr>
+    </w:p>
+    <w:p>
+      <w:pPr>
+        <w:rPr>
+          <w:b/>
+          <w:bCs/>
+          <w:lang w:val="en-US"/>
+        </w:rPr>
+      </w:pPr>
+      <w:r>
+        <w:rPr>
+          <w:b/>
+          <w:bCs/>
+          <w:lang w:val="en-US"/>
+        </w:rPr>
+        <w:t>IMPORTANCE OF GIVING HIGH CORRELATED FEATURE TO MODEL TRAINING</w:t>
+      </w:r>
+    </w:p>
+    <w:p>
+      <w:pPr>
+        <w:rPr>
+          <w:lang w:val="en-US"/>
+        </w:rPr>
+      </w:pPr>
+      <w:r>
+        <w:rPr>
+          <w:lang w:val="en-US"/>
+        </w:rPr>
+        <w:t xml:space="preserve">For all kind of regression model we have to give highly corelated fields with target variable is important, we have to pick a feature that has correlation greater than or equal to the 0.5, in the below describes the house price prediction correlation, the target label price has highly correlated with the feature called room size, so this needs to be </w:t>
+      </w:r>
+      <w:proofErr w:type="spellStart"/>
+      <w:r>
+        <w:rPr>
+          <w:lang w:val="en-US"/>
+        </w:rPr>
+        <w:t>give</w:t>
+      </w:r>
+      <w:proofErr w:type="spellEnd"/>
+      <w:r>
+        <w:rPr>
+          <w:lang w:val="en-US"/>
+        </w:rPr>
+        <w:t xml:space="preserve"> to the model for training, if we give less correlated feature than the model’s accuracy will be </w:t>
+      </w:r>
+      <w:proofErr w:type="spellStart"/>
+      <w:r>
+        <w:rPr>
+          <w:lang w:val="en-US"/>
+        </w:rPr>
+        <w:t>decresed</w:t>
+      </w:r>
+      <w:proofErr w:type="spellEnd"/>
+      <w:r>
+        <w:rPr>
+          <w:lang w:val="en-US"/>
+        </w:rPr>
+        <w:t>.</w:t>
+      </w:r>
+    </w:p>
+    <w:p>
+      <w:pPr>
+        <w:rPr>
+          <w:lang w:val="en-US"/>
+        </w:rPr>
+      </w:pPr>
+      <w:r>
+        <w:rPr>
+          <w:lang w:val="en-US"/>
+        </w:rPr>
+        <w:lastRenderedPageBreak/>
+        <w:drawing>
+          <wp:inline distT="0" distB="0" distL="0" distR="0" wp14:anchorId="4BBE5ACE" wp14:editId="4337CC32">
+            <wp:extent cx="4999153" cy="2743438"/>
+            <wp:effectExtent l="0" t="0" r="0" b="0"/>
+            <wp:docPr id="1090995950" name="Picture 1"/>
+            <wp:cNvGraphicFramePr>
+              <a:graphicFrameLocks xmlns:a="http://schemas.openxmlformats.org/drawingml/2006/main" noChangeAspect="1"/>
+            </wp:cNvGraphicFramePr>
+            <a:graphic xmlns:a="http://schemas.openxmlformats.org/drawingml/2006/main">
+              <a:graphicData uri="http://schemas.openxmlformats.org/drawingml/2006/picture">
+                <pic:pic xmlns:pic="http://schemas.openxmlformats.org/drawingml/2006/picture">
+                  <pic:nvPicPr>
+                    <pic:cNvPr id="1090995950" name=""/>
+                    <pic:cNvPicPr/>
+                  </pic:nvPicPr>
+                  <pic:blipFill>
+                    <a:blip r:embed="rId11"/>
+                    <a:stretch>
+                      <a:fillRect/>
+                    </a:stretch>
+                  </pic:blipFill>
+                  <pic:spPr>
+                    <a:xfrm>
+                      <a:off x="0" y="0"/>
+                      <a:ext cx="4999153" cy="2743438"/>
                     </a:xfrm>
                     <a:prstGeom prst="rect">
                       <a:avLst/>

</xml_diff>